<commit_message>
ignore temp docx file
</commit_message>
<xml_diff>
--- a/技术文档/草稿 V3/Minecraft与LittleTiles导出OBJ基础技术研究文档.docx
+++ b/技术文档/草稿 V3/Minecraft与LittleTiles导出OBJ基础技术研究文档.docx
@@ -4600,10 +4600,6 @@
           <mc:Fallback>
             <w:pict>
               <v:group w14:anchorId="04C36CEB" id="Group 13" o:spid="_x0000_s1038" style="position:absolute;left:0;text-align:left;margin-left:19.6pt;margin-top:22.15pt;width:391.35pt;height:68.35pt;z-index:251663360;mso-height-relative:margin" coordsize="49702,8680" o:gfxdata="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">
-                <v:shapetype id="_x0000_t202" coordsize="21600,21600" o:spt="202" path="m,l,21600r21600,l21600,xe">
-                  <v:stroke joinstyle="miter"/>
-                  <v:path gradientshapeok="t" o:connecttype="rect"/>
-                </v:shapetype>
                 <v:shape id="Text Box 12" o:spid="_x0000_s1039" type="#_x0000_t202" style="position:absolute;width:48748;height:5930;visibility:visible;mso-wrap-style:square;v-text-anchor:top" o:gfxdata="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" filled="f" stroked="f" strokeweight=".5pt">
                   <v:textbox>
                     <w:txbxContent>
@@ -4979,7 +4975,6 @@
         <w:t>文件。</w:t>
       </w:r>
     </w:p>
-    <w:bookmarkStart w:id="7" w:name="_Toc197542912"/>
     <w:p>
       <w:pPr>
         <w:pStyle w:val="TitleL2"/>
@@ -4988,6 +4983,7 @@
           <w:numId w:val="1"/>
         </w:numPr>
       </w:pPr>
+      <w:bookmarkStart w:id="7" w:name="_Toc197542912"/>
       <w:r>
         <w:rPr>
           <w:rFonts w:hint="eastAsia"/>
@@ -9301,6 +9297,9 @@
     <w:p>
       <w:pPr>
         <w:ind w:firstLine="360"/>
+        <w:rPr>
+          <w:iCs/>
+        </w:rPr>
       </w:pPr>
       <w:r>
         <w:rPr>
@@ -9836,9 +9835,57 @@
         <w:t>。</w:t>
       </w:r>
     </w:p>
+    <w:p>
+      <w:pPr>
+        <w:rPr>
+          <w:iCs/>
+        </w:rPr>
+      </w:pPr>
+    </w:p>
+    <w:p>
+      <w:pPr>
+        <w:sectPr>
+          <w:headerReference w:type="even" r:id="rId29"/>
+          <w:headerReference w:type="default" r:id="rId30"/>
+          <w:pgSz w:w="10318" w:h="14570" w:code="13"/>
+          <w:pgMar w:top="720" w:right="720" w:bottom="720" w:left="720" w:header="432" w:footer="720" w:gutter="0"/>
+          <w:cols w:space="720"/>
+          <w:docGrid w:linePitch="360"/>
+        </w:sectPr>
+      </w:pPr>
+    </w:p>
+    <w:p>
+      <w:pPr>
+        <w:pStyle w:val="TitleL1"/>
+        <w:pBdr>
+          <w:bottom w:val="single" w:sz="6" w:space="1" w:color="auto"/>
+        </w:pBdr>
+        <w:spacing w:before="0" w:line="360" w:lineRule="auto"/>
+      </w:pPr>
+      <w:r>
+        <w:lastRenderedPageBreak/>
+        <w:t>LittleTiles</w:t>
+      </w:r>
+      <w:r>
+        <w:rPr>
+          <w:rFonts w:hint="eastAsia"/>
+        </w:rPr>
+        <w:t xml:space="preserve"> </w:t>
+      </w:r>
+      <w:r>
+        <w:rPr>
+          <w:rFonts w:hint="eastAsia"/>
+        </w:rPr>
+        <w:t>技术原理</w:t>
+      </w:r>
+    </w:p>
+    <w:p/>
+    <w:p/>
+    <w:p/>
+    <w:p/>
+    <w:p/>
+    <w:p/>
     <w:sectPr>
-      <w:headerReference w:type="even" r:id="rId29"/>
-      <w:headerReference w:type="default" r:id="rId30"/>
       <w:pgSz w:w="10318" w:h="14570" w:code="13"/>
       <w:pgMar w:top="720" w:right="720" w:bottom="720" w:left="720" w:header="432" w:footer="720" w:gutter="0"/>
       <w:cols w:space="720"/>
@@ -11895,7 +11942,7 @@
         <w:iCs/>
         <w:noProof/>
       </w:rPr>
-      <w:t>Minecraft</w:t>
+      <w:t xml:space="preserve">LittleTiles </w:t>
     </w:r>
     <w:r>
       <w:rPr>
@@ -11904,7 +11951,7 @@
         <w:iCs/>
         <w:noProof/>
       </w:rPr>
-      <w:t>的基础知识</w:t>
+      <w:t>技术原理</w:t>
     </w:r>
     <w:r>
       <w:rPr>

</xml_diff>